<commit_message>
add new versions of thesis
</commit_message>
<xml_diff>
--- a/docs/thesis/thesis.docx
+++ b/docs/thesis/thesis.docx
@@ -410,7 +410,7 @@
           </w:tcPr>
           <w:p>
             <w:pPr>
-              <w:pStyle w:val="a6"/>
+              <w:pStyle w:val="a5"/>
               <w:rPr>
                 <w:rFonts w:cs="B Nazanin"/>
                 <w:sz w:val="28"/>
@@ -430,7 +430,7 @@
           </w:p>
           <w:p>
             <w:pPr>
-              <w:pStyle w:val="a7"/>
+              <w:pStyle w:val="a6"/>
               <w:rPr>
                 <w:rFonts w:cs="B Nazanin"/>
                 <w:sz w:val="22"/>
@@ -440,7 +440,7 @@
           </w:p>
           <w:p>
             <w:pPr>
-              <w:pStyle w:val="a7"/>
+              <w:pStyle w:val="a6"/>
               <w:rPr>
                 <w:rFonts w:cs="B Nazanin"/>
                 <w:sz w:val="22"/>
@@ -497,7 +497,7 @@
           </w:p>
           <w:p>
             <w:pPr>
-              <w:pStyle w:val="a7"/>
+              <w:pStyle w:val="a6"/>
               <w:rPr>
                 <w:rFonts w:cs="B Nazanin"/>
                 <w:sz w:val="22"/>
@@ -531,7 +531,7 @@
           </w:p>
           <w:p>
             <w:pPr>
-              <w:pStyle w:val="a7"/>
+              <w:pStyle w:val="a6"/>
               <w:rPr>
                 <w:rFonts w:cs="B Nazanin"/>
                 <w:sz w:val="22"/>
@@ -1892,468 +1892,36 @@
         <w:footnoteReference w:id="3"/>
       </w:r>
     </w:p>
-    <w:bookmarkEnd w:id="4"/>
     <w:p>
       <w:pPr>
-        <w:spacing w:after="100" w:afterAutospacing="1" w:line="312" w:lineRule="auto"/>
-        <w:ind w:left="-690" w:right="142"/>
-        <w:rPr>
-          <w:rFonts w:ascii="B Nazanin" w:hAnsi="B Nazanin"/>
-          <w:rtl/>
-        </w:rPr>
-      </w:pPr>
-      <w:r>
-        <w:rPr>
-          <w:rFonts w:ascii="B Nazanin" w:hAnsi="B Nazanin"/>
-          <w:rtl/>
-        </w:rPr>
-        <w:t xml:space="preserve">با افزایش حجم متون دیجیتال و گسترش منابع چندزبانه، بازیابی اطلاعات مرتبط و پاسخ‌گویی دقیق به پرسش‌ها، به‌ویژه در محیط‌های دامنه‌بسته، از مسائل مهم در حوزه پردازش زبان طبیعی و بازیابی اطلاعات محسوب می‌شود. هدف این پژوهش، </w:t>
-      </w:r>
-      <w:r>
-        <w:rPr>
-          <w:rFonts w:ascii="B Nazanin" w:hAnsi="B Nazanin"/>
+        <w:ind w:left="-690"/>
+        <w:rPr>
+          <w:rFonts w:hint="cs"/>
           <w:b/>
           <w:bCs/>
           <w:rtl/>
-        </w:rPr>
-        <w:t xml:space="preserve">بررسی، ارزیابی و تحلیل کاربردهای رویکرد مبتنی بر </w:t>
-      </w:r>
-      <w:r>
-        <w:rPr>
-          <w:rFonts w:ascii="B Nazanin" w:hAnsi="B Nazanin"/>
-          <w:b/>
-          <w:bCs/>
-        </w:rPr>
-        <w:t>Semantic Folding</w:t>
-      </w:r>
-      <w:r>
-        <w:rPr>
-          <w:rFonts w:ascii="B Nazanin" w:hAnsi="B Nazanin"/>
-          <w:b/>
-          <w:bCs/>
-          <w:rtl/>
-        </w:rPr>
-        <w:t xml:space="preserve"> متون چندزبانه در بازیابی و پاسخ‌گویی به پرسش‌ها در محیط‌های با دامنه‌بسته</w:t>
-      </w:r>
-      <w:r>
-        <w:rPr>
-          <w:rFonts w:ascii="B Nazanin" w:hAnsi="B Nazanin"/>
-          <w:rtl/>
-        </w:rPr>
-        <w:t xml:space="preserve"> است.</w:t>
-      </w:r>
+          <w:lang w:val="af-ZA" w:eastAsia="af-ZA"/>
+        </w:rPr>
+      </w:pPr>
     </w:p>
     <w:p>
       <w:pPr>
-        <w:spacing w:after="100" w:afterAutospacing="1" w:line="312" w:lineRule="auto"/>
-        <w:ind w:left="-690" w:right="142"/>
+        <w:bidi w:val="0"/>
+        <w:spacing w:after="0" w:line="240" w:lineRule="auto"/>
+        <w:jc w:val="left"/>
         <w:rPr>
           <w:rFonts w:ascii="B Nazanin" w:hAnsi="B Nazanin"/>
           <w:rtl/>
         </w:rPr>
       </w:pPr>
+      <w:bookmarkStart w:id="5" w:name="TOC"/>
+      <w:bookmarkEnd w:id="4"/>
       <w:r>
         <w:rPr>
           <w:rFonts w:ascii="B Nazanin" w:hAnsi="B Nazanin"/>
           <w:rtl/>
         </w:rPr>
-        <w:t xml:space="preserve">در این پژوهش، متون ابتدا با استفاده از روش‌های استخراج عبارت پردازش شده و ماتریس </w:t>
-      </w:r>
-      <w:r>
-        <w:rPr>
-          <w:rFonts w:ascii="B Nazanin" w:hAnsi="B Nazanin"/>
-        </w:rPr>
-        <w:t>Term-Context</w:t>
-      </w:r>
-      <w:r>
-        <w:rPr>
-          <w:rFonts w:ascii="B Nazanin" w:hAnsi="B Nazanin"/>
-          <w:rtl/>
-        </w:rPr>
-        <w:t xml:space="preserve"> مبتنی بر وزن‌دهی </w:t>
-      </w:r>
-      <w:r>
-        <w:rPr>
-          <w:rFonts w:ascii="B Nazanin" w:hAnsi="B Nazanin"/>
-        </w:rPr>
-        <w:t>TF-IDF</w:t>
-      </w:r>
-      <w:r>
-        <w:rPr>
-          <w:rFonts w:ascii="B Nazanin" w:hAnsi="B Nazanin"/>
-          <w:rtl/>
-        </w:rPr>
-        <w:t xml:space="preserve"> ایجاد می‌شود. سپس با استفاده از کاهش ابعاد </w:t>
-      </w:r>
-      <w:r>
-        <w:rPr>
-          <w:rFonts w:ascii="B Nazanin" w:hAnsi="B Nazanin"/>
-        </w:rPr>
-        <w:t>UMAP</w:t>
-      </w:r>
-      <w:r>
-        <w:rPr>
-          <w:rFonts w:ascii="B Nazanin" w:hAnsi="B Nazanin"/>
-          <w:rtl/>
-        </w:rPr>
-        <w:t xml:space="preserve">، روابط معنایی عبارات به یک فضای دوبعدی نگاشت و بر روی شبکه‌ای ۶۴×۶۴ قرار داده می‌شوند. بر اساس این فضا، برای هر عبارت یک </w:t>
-      </w:r>
-      <w:r>
-        <w:rPr>
-          <w:rFonts w:ascii="B Nazanin" w:hAnsi="B Nazanin"/>
-          <w:b/>
-          <w:bCs/>
-        </w:rPr>
-        <w:t>Phrase Fingerprint</w:t>
-      </w:r>
-      <w:r>
-        <w:rPr>
-          <w:rFonts w:ascii="B Nazanin" w:hAnsi="B Nazanin"/>
-          <w:rtl/>
-        </w:rPr>
-        <w:t xml:space="preserve"> و با تجمیع </w:t>
-      </w:r>
-      <w:r>
-        <w:rPr>
-          <w:rFonts w:ascii="B Nazanin" w:hAnsi="B Nazanin"/>
-        </w:rPr>
-        <w:t>fingerprint</w:t>
-      </w:r>
-      <w:r>
-        <w:rPr>
-          <w:rFonts w:ascii="B Nazanin" w:hAnsi="B Nazanin"/>
-          <w:rtl/>
-        </w:rPr>
-        <w:t xml:space="preserve">های عبارات، برای هر سند یک </w:t>
-      </w:r>
-      <w:r>
-        <w:rPr>
-          <w:rFonts w:ascii="B Nazanin" w:hAnsi="B Nazanin"/>
-          <w:b/>
-          <w:bCs/>
-        </w:rPr>
-        <w:t>Document Fingerprint</w:t>
-      </w:r>
-      <w:r>
-        <w:rPr>
-          <w:rFonts w:ascii="B Nazanin" w:hAnsi="B Nazanin"/>
-          <w:rtl/>
-        </w:rPr>
-        <w:t xml:space="preserve"> ایجاد می‌شود. در مرحله بازیابی، پرسش نیز به </w:t>
-      </w:r>
-      <w:r>
-        <w:rPr>
-          <w:rFonts w:ascii="B Nazanin" w:hAnsi="B Nazanin"/>
-        </w:rPr>
-        <w:t>fingerprint</w:t>
-      </w:r>
-      <w:r>
-        <w:rPr>
-          <w:rFonts w:ascii="B Nazanin" w:hAnsi="B Nazanin"/>
-          <w:rtl/>
-        </w:rPr>
-        <w:t xml:space="preserve"> تبدیل شده و با استفاده از </w:t>
-      </w:r>
-      <w:r>
-        <w:rPr>
-          <w:rFonts w:ascii="B Nazanin" w:hAnsi="B Nazanin"/>
-        </w:rPr>
-        <w:t>spreading</w:t>
-      </w:r>
-      <w:r>
-        <w:rPr>
-          <w:rFonts w:ascii="B Nazanin" w:hAnsi="B Nazanin"/>
-          <w:rtl/>
-        </w:rPr>
-        <w:t xml:space="preserve"> و محاسبه شباهت کسینوسی، اسناد مرتبط رتبه‌بندی می‌شوند. همچنین امکان ترکیب نتایج </w:t>
-      </w:r>
-      <w:r>
-        <w:rPr>
-          <w:rFonts w:ascii="B Nazanin" w:hAnsi="B Nazanin"/>
-        </w:rPr>
-        <w:t>Semantic Folding</w:t>
-      </w:r>
-      <w:r>
-        <w:rPr>
-          <w:rFonts w:ascii="B Nazanin" w:hAnsi="B Nazanin"/>
-          <w:rtl/>
-        </w:rPr>
-        <w:t xml:space="preserve"> با مدل </w:t>
-      </w:r>
-      <w:r>
-        <w:rPr>
-          <w:rFonts w:ascii="B Nazanin" w:hAnsi="B Nazanin"/>
-        </w:rPr>
-        <w:t>sparse</w:t>
-      </w:r>
-      <w:r>
-        <w:rPr>
-          <w:rFonts w:ascii="B Nazanin" w:hAnsi="B Nazanin"/>
-          <w:rtl/>
-        </w:rPr>
-        <w:t xml:space="preserve"> بازیابی </w:t>
-      </w:r>
-      <w:r>
-        <w:rPr>
-          <w:rFonts w:ascii="B Nazanin" w:hAnsi="B Nazanin"/>
-        </w:rPr>
-        <w:t>SPLADE</w:t>
-      </w:r>
-      <w:r>
-        <w:rPr>
-          <w:rFonts w:ascii="B Nazanin" w:hAnsi="B Nazanin"/>
-          <w:rtl/>
-        </w:rPr>
-        <w:t xml:space="preserve"> با استفاده از روش‌های </w:t>
-      </w:r>
-      <w:r>
-        <w:rPr>
-          <w:rFonts w:ascii="B Nazanin" w:hAnsi="B Nazanin"/>
-        </w:rPr>
-        <w:t>Linear</w:t>
-      </w:r>
-      <w:r>
-        <w:rPr>
-          <w:rFonts w:ascii="B Nazanin" w:hAnsi="B Nazanin"/>
-          <w:rtl/>
-        </w:rPr>
-        <w:t xml:space="preserve"> و </w:t>
-      </w:r>
-      <w:r>
-        <w:rPr>
-          <w:rFonts w:ascii="B Nazanin" w:hAnsi="B Nazanin"/>
-        </w:rPr>
-        <w:t>RRF</w:t>
-      </w:r>
-      <w:r>
-        <w:rPr>
-          <w:rFonts w:ascii="B Nazanin" w:hAnsi="B Nazanin"/>
-          <w:b/>
-          <w:bCs/>
-          <w:sz w:val="22"/>
-          <w:szCs w:val="26"/>
-          <w:vertAlign w:val="superscript"/>
-          <w:lang w:val="af-ZA" w:eastAsia="af-ZA"/>
-        </w:rPr>
-        <w:footnoteReference w:id="4"/>
-      </w:r>
-      <w:r>
-        <w:rPr>
-          <w:rFonts w:ascii="B Nazanin" w:hAnsi="B Nazanin"/>
-          <w:rtl/>
-        </w:rPr>
-        <w:t xml:space="preserve"> بررسی می‌شود.</w:t>
-      </w:r>
-    </w:p>
-    <w:p>
-      <w:pPr>
-        <w:spacing w:after="100" w:afterAutospacing="1" w:line="312" w:lineRule="auto"/>
-        <w:ind w:left="-690" w:right="142"/>
-        <w:rPr>
-          <w:rFonts w:ascii="B Nazanin" w:hAnsi="B Nazanin"/>
-          <w:rtl/>
-        </w:rPr>
-      </w:pPr>
-      <w:r>
-        <w:rPr>
-          <w:rFonts w:ascii="B Nazanin" w:hAnsi="B Nazanin"/>
-          <w:rtl/>
-        </w:rPr>
-        <w:t xml:space="preserve">برای ارزیابی روش پیشنهادی، یک چارچوب </w:t>
-      </w:r>
-      <w:r>
-        <w:rPr>
-          <w:rFonts w:ascii="B Nazanin" w:hAnsi="B Nazanin"/>
-        </w:rPr>
-        <w:t>benchmark</w:t>
-      </w:r>
-      <w:r>
-        <w:rPr>
-          <w:rFonts w:ascii="B Nazanin" w:hAnsi="B Nazanin"/>
-          <w:rtl/>
-        </w:rPr>
-        <w:t xml:space="preserve"> مستقل طراحی شده است که عملکرد سیستم را با معیارهایی نظیر </w:t>
-      </w:r>
-      <w:r>
-        <w:rPr>
-          <w:rFonts w:ascii="B Nazanin" w:hAnsi="B Nazanin"/>
-          <w:b/>
-          <w:bCs/>
-        </w:rPr>
-        <w:t>MRR</w:t>
-      </w:r>
-      <w:r>
-        <w:rPr>
-          <w:rFonts w:ascii="B Nazanin" w:hAnsi="B Nazanin"/>
-          <w:b/>
-          <w:bCs/>
-          <w:rtl/>
-        </w:rPr>
-        <w:t xml:space="preserve">، </w:t>
-      </w:r>
-      <w:r>
-        <w:rPr>
-          <w:rFonts w:ascii="B Nazanin" w:hAnsi="B Nazanin"/>
-          <w:b/>
-          <w:bCs/>
-        </w:rPr>
-        <w:t>AP</w:t>
-      </w:r>
-      <w:r>
-        <w:rPr>
-          <w:rFonts w:ascii="B Nazanin" w:hAnsi="B Nazanin"/>
-          <w:b/>
-          <w:bCs/>
-          <w:rtl/>
-        </w:rPr>
-        <w:t xml:space="preserve">، </w:t>
-      </w:r>
-      <w:r>
-        <w:rPr>
-          <w:rFonts w:ascii="B Nazanin" w:hAnsi="B Nazanin"/>
-          <w:b/>
-          <w:bCs/>
-        </w:rPr>
-        <w:t>Precision</w:t>
-      </w:r>
-      <w:r>
-        <w:rPr>
-          <w:rFonts w:ascii="B Nazanin" w:hAnsi="B Nazanin"/>
-          <w:b/>
-          <w:bCs/>
-          <w:rtl/>
-        </w:rPr>
-        <w:t xml:space="preserve">، </w:t>
-      </w:r>
-      <w:r>
-        <w:rPr>
-          <w:rFonts w:ascii="B Nazanin" w:hAnsi="B Nazanin"/>
-          <w:b/>
-          <w:bCs/>
-        </w:rPr>
-        <w:t>Recall</w:t>
-      </w:r>
-      <w:r>
-        <w:rPr>
-          <w:rFonts w:ascii="B Nazanin" w:hAnsi="B Nazanin"/>
-          <w:b/>
-          <w:bCs/>
-          <w:rtl/>
-        </w:rPr>
-        <w:t xml:space="preserve"> و </w:t>
-      </w:r>
-      <w:r>
-        <w:rPr>
-          <w:rFonts w:ascii="B Nazanin" w:hAnsi="B Nazanin"/>
-          <w:b/>
-          <w:bCs/>
-        </w:rPr>
-        <w:t>NDCG</w:t>
-      </w:r>
-      <w:r>
-        <w:rPr>
-          <w:rFonts w:ascii="B Nazanin" w:hAnsi="B Nazanin"/>
-          <w:rtl/>
-        </w:rPr>
-        <w:t xml:space="preserve"> ارزیابی می‌کند. در نهایت، نتایج آزمایش‌ها برای بررسی توانایی </w:t>
-      </w:r>
-      <w:r>
-        <w:rPr>
-          <w:rFonts w:ascii="B Nazanin" w:hAnsi="B Nazanin"/>
-        </w:rPr>
-        <w:t>Semantic Folding</w:t>
-      </w:r>
-      <w:r>
-        <w:rPr>
-          <w:rFonts w:ascii="B Nazanin" w:hAnsi="B Nazanin"/>
-          <w:rtl/>
-        </w:rPr>
-        <w:t xml:space="preserve"> در نمایش فضایی و بازیابی متون چندزبانه و همچنین تأثیر ترکیب آن با روش‌های بازیابی عصبی تحلیل می‌شوند.</w:t>
-      </w:r>
-    </w:p>
-    <w:p>
-      <w:pPr>
-        <w:spacing w:after="100" w:afterAutospacing="1" w:line="312" w:lineRule="auto"/>
-        <w:ind w:left="-690" w:right="142"/>
-        <w:rPr>
-          <w:rFonts w:asciiTheme="minorHAnsi" w:hAnsiTheme="minorHAnsi"/>
-          <w:rtl/>
-        </w:rPr>
-      </w:pPr>
-      <w:r>
-        <w:rPr>
-          <w:rFonts w:ascii="B Nazanin" w:hAnsi="B Nazanin"/>
-          <w:b/>
-          <w:bCs/>
-          <w:rtl/>
-        </w:rPr>
-        <w:t xml:space="preserve">کلمات کلیدی: </w:t>
-      </w:r>
-      <w:r>
-        <w:rPr>
-          <w:rFonts w:ascii="B Nazanin" w:hAnsi="B Nazanin"/>
-        </w:rPr>
-        <w:t>Semantic Folding</w:t>
-      </w:r>
-      <w:r>
-        <w:rPr>
-          <w:rFonts w:ascii="B Nazanin" w:hAnsi="B Nazanin"/>
-          <w:rtl/>
-        </w:rPr>
-        <w:t xml:space="preserve">، بازیابی اطلاعات، پاسخ‌گویی به پرسش، دامنه‌بسته، بازیابی متون چندزبانه، </w:t>
-      </w:r>
-      <w:r>
-        <w:rPr>
-          <w:rFonts w:ascii="B Nazanin" w:hAnsi="B Nazanin"/>
-        </w:rPr>
-        <w:t>Semantic Space</w:t>
-      </w:r>
-      <w:r>
-        <w:rPr>
-          <w:rFonts w:ascii="B Nazanin" w:hAnsi="B Nazanin"/>
-          <w:rtl/>
-        </w:rPr>
-        <w:t xml:space="preserve">، </w:t>
-      </w:r>
-      <w:r>
-        <w:rPr>
-          <w:rFonts w:ascii="B Nazanin" w:hAnsi="B Nazanin"/>
-        </w:rPr>
-        <w:t xml:space="preserve">Phrase </w:t>
-      </w:r>
-      <w:r>
-        <w:rPr>
-          <w:rFonts w:ascii="Calibri" w:hAnsi="Calibri" w:cs="Calibri"/>
-        </w:rPr>
-        <w:t xml:space="preserve">and Document </w:t>
-      </w:r>
-      <w:r>
-        <w:rPr>
-          <w:rFonts w:ascii="B Nazanin" w:hAnsi="B Nazanin"/>
-        </w:rPr>
-        <w:t>Fingerprint</w:t>
-      </w:r>
-      <w:r>
-        <w:rPr>
-          <w:rFonts w:ascii="B Nazanin" w:hAnsi="B Nazanin"/>
-          <w:rtl/>
-        </w:rPr>
-        <w:t xml:space="preserve">، </w:t>
-      </w:r>
-      <w:r>
-        <w:rPr>
-          <w:rFonts w:ascii="B Nazanin" w:hAnsi="B Nazanin"/>
-        </w:rPr>
-        <w:t>SPLADE</w:t>
-      </w:r>
-      <w:r>
-        <w:rPr>
-          <w:rFonts w:ascii="B Nazanin" w:hAnsi="B Nazanin"/>
-          <w:b/>
-          <w:bCs/>
-          <w:rtl/>
-        </w:rPr>
-        <w:t>.</w:t>
+        <w:br w:type="page"/>
       </w:r>
     </w:p>
     <w:p>
@@ -2368,7 +1936,6 @@
           <w:lang w:val="af-ZA" w:eastAsia="af-ZA" w:bidi="ar-SA"/>
         </w:rPr>
       </w:pPr>
-      <w:bookmarkStart w:id="5" w:name="TOC"/>
       <w:r>
         <w:rPr>
           <w:rFonts w:hint="cs"/>
@@ -7443,7 +7010,7 @@
     </w:p>
     <w:p>
       <w:pPr>
-        <w:pStyle w:val="ac"/>
+        <w:pStyle w:val="ab"/>
         <w:ind w:left="-1050"/>
         <w:rPr>
           <w:rtl/>
@@ -7459,7 +7026,7 @@
     </w:p>
     <w:p>
       <w:pPr>
-        <w:pStyle w:val="ac"/>
+        <w:pStyle w:val="ab"/>
         <w:ind w:left="-1050"/>
         <w:rPr>
           <w:rtl/>
@@ -7468,7 +7035,7 @@
     </w:p>
     <w:p>
       <w:pPr>
-        <w:pStyle w:val="ab"/>
+        <w:pStyle w:val="aa"/>
         <w:ind w:left="-780" w:firstLine="0"/>
         <w:rPr>
           <w:rtl/>
@@ -7831,7 +7398,7 @@
     </w:p>
     <w:p>
       <w:pPr>
-        <w:pStyle w:val="a8"/>
+        <w:pStyle w:val="a7"/>
         <w:rPr>
           <w:rtl/>
           <w:lang w:bidi="fa-IR"/>
@@ -7847,7 +7414,7 @@
     </w:p>
     <w:p>
       <w:pPr>
-        <w:pStyle w:val="ab"/>
+        <w:pStyle w:val="aa"/>
         <w:bidi w:val="0"/>
         <w:ind w:left="-690" w:firstLine="0"/>
       </w:pPr>
@@ -8166,7 +7733,7 @@
     </w:p>
     <w:p>
       <w:pPr>
-        <w:pStyle w:val="a8"/>
+        <w:pStyle w:val="a7"/>
         <w:ind w:left="-690"/>
         <w:rPr>
           <w:lang w:bidi="fa-IR"/>
@@ -9223,12 +8790,12 @@
     </w:p>
     <w:p>
       <w:pPr>
-        <w:pStyle w:val="a8"/>
+        <w:pStyle w:val="a7"/>
       </w:pPr>
     </w:p>
     <w:p>
       <w:pPr>
-        <w:pStyle w:val="a8"/>
+        <w:pStyle w:val="a7"/>
         <w:rPr>
           <w:rtl/>
           <w:lang w:bidi="fa-IR"/>
@@ -9237,7 +8804,7 @@
     </w:p>
     <w:p>
       <w:pPr>
-        <w:pStyle w:val="a8"/>
+        <w:pStyle w:val="a7"/>
         <w:rPr>
           <w:rtl/>
           <w:lang w:bidi="fa-IR"/>
@@ -9246,7 +8813,7 @@
     </w:p>
     <w:p>
       <w:pPr>
-        <w:pStyle w:val="a8"/>
+        <w:pStyle w:val="a7"/>
         <w:rPr>
           <w:rtl/>
           <w:lang w:bidi="fa-IR"/>
@@ -9255,7 +8822,7 @@
     </w:p>
     <w:p>
       <w:pPr>
-        <w:pStyle w:val="a8"/>
+        <w:pStyle w:val="a7"/>
         <w:rPr>
           <w:rtl/>
           <w:lang w:bidi="fa-IR"/>
@@ -9307,7 +8874,7 @@
     </w:p>
     <w:p>
       <w:pPr>
-        <w:pStyle w:val="a5"/>
+        <w:pStyle w:val="a4"/>
         <w:numPr>
           <w:ilvl w:val="0"/>
           <w:numId w:val="23"/>
@@ -9362,7 +8929,7 @@
     </w:p>
     <w:p>
       <w:pPr>
-        <w:pStyle w:val="a8"/>
+        <w:pStyle w:val="a7"/>
         <w:rPr>
           <w:rtl/>
           <w:lang w:bidi="fa-IR"/>
@@ -9530,7 +9097,7 @@
     </w:p>
     <w:p>
       <w:pPr>
-        <w:pStyle w:val="a8"/>
+        <w:pStyle w:val="a7"/>
         <w:rPr>
           <w:rtl/>
           <w:lang w:bidi="fa-IR"/>
@@ -10412,7 +9979,7 @@
     </w:p>
     <w:p>
       <w:pPr>
-        <w:pStyle w:val="a8"/>
+        <w:pStyle w:val="a7"/>
         <w:rPr>
           <w:rtl/>
           <w:lang w:bidi="fa-IR"/>
@@ -10421,7 +9988,7 @@
     </w:p>
     <w:p>
       <w:pPr>
-        <w:pStyle w:val="a8"/>
+        <w:pStyle w:val="a7"/>
         <w:rPr>
           <w:rtl/>
           <w:lang w:bidi="fa-IR"/>
@@ -11077,7 +10644,7 @@
     </w:p>
     <w:p>
       <w:pPr>
-        <w:pStyle w:val="a8"/>
+        <w:pStyle w:val="a7"/>
         <w:rPr>
           <w:rtl/>
           <w:lang w:bidi="fa-IR"/>
@@ -11086,7 +10653,7 @@
     </w:p>
     <w:p>
       <w:pPr>
-        <w:pStyle w:val="a8"/>
+        <w:pStyle w:val="a7"/>
         <w:rPr>
           <w:rtl/>
           <w:lang w:bidi="fa-IR"/>
@@ -11448,7 +11015,7 @@
           <w:rtl/>
           <w:lang w:bidi="fa-IR"/>
         </w:rPr>
-        <w:footnoteReference w:id="5"/>
+        <w:footnoteReference w:id="4"/>
       </w:r>
       <w:r>
         <w:rPr>
@@ -11912,7 +11479,7 @@
     </w:p>
     <w:p>
       <w:pPr>
-        <w:pStyle w:val="a8"/>
+        <w:pStyle w:val="a7"/>
         <w:rPr>
           <w:rtl/>
           <w:lang w:bidi="fa-IR"/>
@@ -11921,7 +11488,7 @@
     </w:p>
     <w:p>
       <w:pPr>
-        <w:pStyle w:val="a8"/>
+        <w:pStyle w:val="a7"/>
         <w:rPr>
           <w:rtl/>
           <w:lang w:bidi="fa-IR"/>
@@ -12680,7 +12247,7 @@
     </w:p>
     <w:p>
       <w:pPr>
-        <w:pStyle w:val="a8"/>
+        <w:pStyle w:val="a7"/>
         <w:rPr>
           <w:rtl/>
           <w:lang w:bidi="fa-IR"/>
@@ -12706,7 +12273,7 @@
     </w:p>
     <w:p>
       <w:pPr>
-        <w:pStyle w:val="a8"/>
+        <w:pStyle w:val="a7"/>
         <w:rPr>
           <w:rtl/>
           <w:lang w:bidi="fa-IR"/>
@@ -13046,7 +12613,7 @@
     </w:p>
     <w:p>
       <w:pPr>
-        <w:pStyle w:val="a8"/>
+        <w:pStyle w:val="a7"/>
         <w:rPr>
           <w:rtl/>
           <w:lang w:bidi="fa-IR"/>
@@ -13055,7 +12622,7 @@
     </w:p>
     <w:p>
       <w:pPr>
-        <w:pStyle w:val="a8"/>
+        <w:pStyle w:val="a7"/>
         <w:rPr>
           <w:rtl/>
           <w:lang w:bidi="fa-IR"/>
@@ -13676,7 +13243,7 @@
     </w:p>
     <w:p>
       <w:pPr>
-        <w:pStyle w:val="a8"/>
+        <w:pStyle w:val="a7"/>
         <w:rPr>
           <w:rtl/>
           <w:lang w:bidi="fa-IR"/>
@@ -13685,7 +13252,7 @@
     </w:p>
     <w:p>
       <w:pPr>
-        <w:pStyle w:val="a8"/>
+        <w:pStyle w:val="a7"/>
         <w:rPr>
           <w:rtl/>
           <w:lang w:bidi="fa-IR"/>
@@ -14302,7 +13869,7 @@
     </w:p>
     <w:p>
       <w:pPr>
-        <w:pStyle w:val="a8"/>
+        <w:pStyle w:val="a7"/>
         <w:rPr>
           <w:rtl/>
           <w:lang w:bidi="fa-IR"/>
@@ -14311,7 +13878,7 @@
     </w:p>
     <w:p>
       <w:pPr>
-        <w:pStyle w:val="a8"/>
+        <w:pStyle w:val="a7"/>
         <w:rPr>
           <w:rtl/>
           <w:lang w:bidi="fa-IR"/>
@@ -15032,7 +14599,7 @@
     </w:p>
     <w:p>
       <w:pPr>
-        <w:pStyle w:val="a8"/>
+        <w:pStyle w:val="a7"/>
         <w:rPr>
           <w:rtl/>
           <w:lang w:bidi="fa-IR"/>
@@ -15041,7 +14608,7 @@
     </w:p>
     <w:p>
       <w:pPr>
-        <w:pStyle w:val="a8"/>
+        <w:pStyle w:val="a7"/>
         <w:rPr>
           <w:rtl/>
           <w:lang w:bidi="fa-IR"/>
@@ -17865,7 +17432,7 @@
     </w:p>
     <w:p>
       <w:pPr>
-        <w:pStyle w:val="a8"/>
+        <w:pStyle w:val="a7"/>
         <w:rPr>
           <w:rtl/>
           <w:lang w:bidi="fa-IR"/>
@@ -18147,7 +17714,7 @@
     </w:p>
     <w:p>
       <w:pPr>
-        <w:pStyle w:val="a8"/>
+        <w:pStyle w:val="a7"/>
         <w:rPr>
           <w:rtl/>
           <w:lang w:bidi="fa-IR"/>
@@ -18156,7 +17723,7 @@
     </w:p>
     <w:p>
       <w:pPr>
-        <w:pStyle w:val="a8"/>
+        <w:pStyle w:val="a7"/>
         <w:rPr>
           <w:rtl/>
           <w:lang w:bidi="fa-IR"/>
@@ -18709,7 +18276,7 @@
     </w:p>
     <w:p>
       <w:pPr>
-        <w:pStyle w:val="a8"/>
+        <w:pStyle w:val="a7"/>
         <w:rPr>
           <w:rtl/>
           <w:lang w:bidi="fa-IR"/>
@@ -18718,7 +18285,7 @@
     </w:p>
     <w:p>
       <w:pPr>
-        <w:pStyle w:val="a8"/>
+        <w:pStyle w:val="a7"/>
         <w:rPr>
           <w:rtl/>
           <w:lang w:bidi="fa-IR"/>
@@ -19289,7 +18856,7 @@
     </w:p>
     <w:p>
       <w:pPr>
-        <w:pStyle w:val="a8"/>
+        <w:pStyle w:val="a7"/>
         <w:rPr>
           <w:rtl/>
           <w:lang w:bidi="fa-IR"/>
@@ -19298,7 +18865,7 @@
     </w:p>
     <w:p>
       <w:pPr>
-        <w:pStyle w:val="a8"/>
+        <w:pStyle w:val="a7"/>
         <w:rPr>
           <w:rtl/>
           <w:lang w:bidi="fa-IR"/>
@@ -19669,7 +19236,7 @@
     </w:p>
     <w:p>
       <w:pPr>
-        <w:pStyle w:val="a8"/>
+        <w:pStyle w:val="a7"/>
         <w:rPr>
           <w:rtl/>
         </w:rPr>
@@ -19690,7 +19257,7 @@
     </w:p>
     <w:p>
       <w:pPr>
-        <w:pStyle w:val="a8"/>
+        <w:pStyle w:val="a7"/>
         <w:rPr>
           <w:rtl/>
         </w:rPr>
@@ -19698,7 +19265,7 @@
     </w:p>
     <w:p>
       <w:pPr>
-        <w:pStyle w:val="a8"/>
+        <w:pStyle w:val="a7"/>
         <w:rPr>
           <w:rtl/>
         </w:rPr>
@@ -20014,7 +19581,7 @@
     </w:p>
     <w:p>
       <w:pPr>
-        <w:pStyle w:val="a8"/>
+        <w:pStyle w:val="a7"/>
         <w:rPr>
           <w:rtl/>
         </w:rPr>
@@ -20022,7 +19589,7 @@
     </w:p>
     <w:p>
       <w:pPr>
-        <w:pStyle w:val="a8"/>
+        <w:pStyle w:val="a7"/>
         <w:rPr>
           <w:rtl/>
         </w:rPr>
@@ -20050,7 +19617,7 @@
     </w:p>
     <w:p>
       <w:pPr>
-        <w:pStyle w:val="a8"/>
+        <w:pStyle w:val="a7"/>
         <w:rPr>
           <w:rtl/>
         </w:rPr>
@@ -20058,7 +19625,7 @@
     </w:p>
     <w:p>
       <w:pPr>
-        <w:pStyle w:val="a8"/>
+        <w:pStyle w:val="a7"/>
         <w:rPr>
           <w:rtl/>
         </w:rPr>
@@ -20092,7 +19659,7 @@
     </w:p>
     <w:p>
       <w:pPr>
-        <w:pStyle w:val="a8"/>
+        <w:pStyle w:val="a7"/>
         <w:rPr>
           <w:rtl/>
         </w:rPr>
@@ -20100,7 +19667,7 @@
     </w:p>
     <w:p>
       <w:pPr>
-        <w:pStyle w:val="a8"/>
+        <w:pStyle w:val="a7"/>
         <w:rPr>
           <w:rtl/>
         </w:rPr>
@@ -20219,7 +19786,7 @@
     </w:p>
     <w:p>
       <w:pPr>
-        <w:pStyle w:val="a8"/>
+        <w:pStyle w:val="a7"/>
         <w:rPr>
           <w:rtl/>
         </w:rPr>
@@ -20366,7 +19933,7 @@
     </w:p>
     <w:p>
       <w:pPr>
-        <w:pStyle w:val="a8"/>
+        <w:pStyle w:val="a7"/>
         <w:rPr>
           <w:rtl/>
         </w:rPr>
@@ -20478,7 +20045,7 @@
     </w:p>
     <w:p>
       <w:pPr>
-        <w:pStyle w:val="a8"/>
+        <w:pStyle w:val="a7"/>
         <w:rPr>
           <w:rtl/>
         </w:rPr>
@@ -20605,7 +20172,7 @@
     </w:p>
     <w:p>
       <w:pPr>
-        <w:pStyle w:val="a8"/>
+        <w:pStyle w:val="a7"/>
         <w:rPr>
           <w:rtl/>
         </w:rPr>
@@ -20684,7 +20251,7 @@
     </w:p>
     <w:p>
       <w:pPr>
-        <w:pStyle w:val="a8"/>
+        <w:pStyle w:val="a7"/>
         <w:rPr>
           <w:rtl/>
         </w:rPr>
@@ -20822,7 +20389,7 @@
     </w:p>
     <w:p>
       <w:pPr>
-        <w:pStyle w:val="a8"/>
+        <w:pStyle w:val="a7"/>
         <w:rPr>
           <w:rtl/>
         </w:rPr>
@@ -20906,7 +20473,7 @@
     </w:p>
     <w:p>
       <w:pPr>
-        <w:pStyle w:val="a8"/>
+        <w:pStyle w:val="a7"/>
         <w:rPr>
           <w:rtl/>
         </w:rPr>
@@ -21047,7 +20614,7 @@
     </w:p>
     <w:p>
       <w:pPr>
-        <w:pStyle w:val="a8"/>
+        <w:pStyle w:val="a7"/>
         <w:rPr>
           <w:rtl/>
         </w:rPr>
@@ -21164,7 +20731,7 @@
     </w:p>
     <w:p>
       <w:pPr>
-        <w:pStyle w:val="a8"/>
+        <w:pStyle w:val="a7"/>
       </w:pPr>
       <w:r>
         <w:rPr>
@@ -21318,7 +20885,7 @@
     </w:p>
     <w:p>
       <w:pPr>
-        <w:pStyle w:val="af2"/>
+        <w:pStyle w:val="af1"/>
         <w:rPr>
           <w:rtl/>
         </w:rPr>
@@ -21343,7 +20910,7 @@
     </w:p>
     <w:p>
       <w:pPr>
-        <w:pStyle w:val="af2"/>
+        <w:pStyle w:val="af1"/>
         <w:rPr>
           <w:rtl/>
         </w:rPr>
@@ -21619,7 +21186,7 @@
     </w:p>
     <w:p>
       <w:pPr>
-        <w:pStyle w:val="af2"/>
+        <w:pStyle w:val="af1"/>
         <w:rPr>
           <w:rtl/>
         </w:rPr>
@@ -21627,7 +21194,7 @@
     </w:p>
     <w:p>
       <w:pPr>
-        <w:pStyle w:val="af2"/>
+        <w:pStyle w:val="af1"/>
         <w:rPr>
           <w:rtl/>
         </w:rPr>
@@ -21922,7 +21489,7 @@
     </w:p>
     <w:p>
       <w:pPr>
-        <w:pStyle w:val="af2"/>
+        <w:pStyle w:val="af1"/>
         <w:rPr>
           <w:rtl/>
         </w:rPr>
@@ -21930,7 +21497,7 @@
     </w:p>
     <w:p>
       <w:pPr>
-        <w:pStyle w:val="af2"/>
+        <w:pStyle w:val="af1"/>
         <w:rPr>
           <w:rtl/>
         </w:rPr>
@@ -22243,7 +21810,7 @@
     </w:p>
     <w:p>
       <w:pPr>
-        <w:pStyle w:val="af2"/>
+        <w:pStyle w:val="af1"/>
         <w:rPr>
           <w:rtl/>
         </w:rPr>
@@ -22251,7 +21818,7 @@
     </w:p>
     <w:p>
       <w:pPr>
-        <w:pStyle w:val="af2"/>
+        <w:pStyle w:val="af1"/>
         <w:rPr>
           <w:rtl/>
         </w:rPr>
@@ -22607,7 +22174,7 @@
     </w:p>
     <w:p>
       <w:pPr>
-        <w:pStyle w:val="af2"/>
+        <w:pStyle w:val="af1"/>
         <w:rPr>
           <w:rtl/>
         </w:rPr>
@@ -22615,7 +22182,7 @@
     </w:p>
     <w:p>
       <w:pPr>
-        <w:pStyle w:val="af2"/>
+        <w:pStyle w:val="af1"/>
       </w:pPr>
       <w:r>
         <w:rPr>
@@ -22994,7 +22561,7 @@
     </w:p>
     <w:p>
       <w:pPr>
-        <w:pStyle w:val="a8"/>
+        <w:pStyle w:val="a7"/>
         <w:rPr>
           <w:rtl/>
         </w:rPr>
@@ -23019,7 +22586,7 @@
     </w:p>
     <w:p>
       <w:pPr>
-        <w:pStyle w:val="a8"/>
+        <w:pStyle w:val="a7"/>
         <w:rPr>
           <w:rtl/>
         </w:rPr>
@@ -23093,7 +22660,7 @@
     </w:p>
     <w:p>
       <w:pPr>
-        <w:pStyle w:val="a8"/>
+        <w:pStyle w:val="a7"/>
         <w:rPr>
           <w:rtl/>
         </w:rPr>
@@ -23101,7 +22668,7 @@
     </w:p>
     <w:p>
       <w:pPr>
-        <w:pStyle w:val="a8"/>
+        <w:pStyle w:val="a7"/>
         <w:rPr>
           <w:rtl/>
         </w:rPr>
@@ -23361,7 +22928,7 @@
     </w:p>
     <w:p>
       <w:pPr>
-        <w:pStyle w:val="a8"/>
+        <w:pStyle w:val="a7"/>
         <w:rPr>
           <w:rtl/>
         </w:rPr>
@@ -23369,7 +22936,7 @@
     </w:p>
     <w:p>
       <w:pPr>
-        <w:pStyle w:val="a8"/>
+        <w:pStyle w:val="a7"/>
         <w:rPr>
           <w:rtl/>
         </w:rPr>
@@ -23917,7 +23484,7 @@
     </w:p>
     <w:p>
       <w:pPr>
-        <w:pStyle w:val="a8"/>
+        <w:pStyle w:val="a7"/>
         <w:rPr>
           <w:rtl/>
         </w:rPr>
@@ -23925,7 +23492,7 @@
     </w:p>
     <w:p>
       <w:pPr>
-        <w:pStyle w:val="a8"/>
+        <w:pStyle w:val="a7"/>
         <w:rPr>
           <w:rtl/>
         </w:rPr>
@@ -24302,7 +23869,7 @@
     </w:p>
     <w:p>
       <w:pPr>
-        <w:pStyle w:val="a8"/>
+        <w:pStyle w:val="a7"/>
         <w:rPr>
           <w:rtl/>
         </w:rPr>
@@ -24310,7 +23877,7 @@
     </w:p>
     <w:p>
       <w:pPr>
-        <w:pStyle w:val="a8"/>
+        <w:pStyle w:val="a7"/>
         <w:rPr>
           <w:rtl/>
         </w:rPr>
@@ -24644,7 +24211,7 @@
     </w:p>
     <w:p>
       <w:pPr>
-        <w:pStyle w:val="a8"/>
+        <w:pStyle w:val="a7"/>
         <w:rPr>
           <w:rtl/>
         </w:rPr>
@@ -24652,7 +24219,7 @@
     </w:p>
     <w:p>
       <w:pPr>
-        <w:pStyle w:val="a8"/>
+        <w:pStyle w:val="a7"/>
         <w:rPr>
           <w:rtl/>
         </w:rPr>
@@ -24943,7 +24510,7 @@
     <w:bookmarkEnd w:id="17"/>
     <w:p>
       <w:pPr>
-        <w:pStyle w:val="a8"/>
+        <w:pStyle w:val="a7"/>
         <w:rPr>
           <w:rtl/>
         </w:rPr>
@@ -25028,7 +24595,7 @@
     </w:p>
     <w:p>
       <w:pPr>
-        <w:pStyle w:val="a5"/>
+        <w:pStyle w:val="a4"/>
         <w:numPr>
           <w:ilvl w:val="0"/>
           <w:numId w:val="23"/>
@@ -25173,7 +24740,7 @@
     </w:p>
     <w:p>
       <w:pPr>
-        <w:pStyle w:val="a8"/>
+        <w:pStyle w:val="a7"/>
         <w:rPr>
           <w:rtl/>
           <w:lang w:bidi="fa-IR"/>
@@ -25182,7 +24749,7 @@
     </w:p>
     <w:p>
       <w:pPr>
-        <w:pStyle w:val="a8"/>
+        <w:pStyle w:val="a7"/>
         <w:jc w:val="left"/>
         <w:rPr>
           <w:rtl/>
@@ -25236,7 +24803,7 @@
     </w:p>
     <w:p>
       <w:pPr>
-        <w:pStyle w:val="a8"/>
+        <w:pStyle w:val="a7"/>
         <w:ind w:firstLine="708"/>
         <w:rPr>
           <w:rFonts w:ascii="B Nazanin"/>
@@ -25308,7 +24875,7 @@
     </w:p>
     <w:p>
       <w:pPr>
-        <w:pStyle w:val="a8"/>
+        <w:pStyle w:val="a7"/>
         <w:rPr>
           <w:lang w:bidi="fa-IR"/>
         </w:rPr>
@@ -25323,7 +24890,7 @@
     </w:p>
     <w:p>
       <w:pPr>
-        <w:pStyle w:val="a8"/>
+        <w:pStyle w:val="a7"/>
         <w:rPr>
           <w:rtl/>
           <w:lang w:bidi="fa-IR"/>
@@ -25442,7 +25009,7 @@
     </w:p>
     <w:p>
       <w:pPr>
-        <w:pStyle w:val="a8"/>
+        <w:pStyle w:val="a7"/>
         <w:keepNext/>
         <w:jc w:val="center"/>
       </w:pPr>
@@ -25507,7 +25074,7 @@
     </w:p>
     <w:p>
       <w:pPr>
-        <w:pStyle w:val="a1"/>
+        <w:pStyle w:val="af2"/>
         <w:rPr>
           <w:rtl/>
         </w:rPr>
@@ -25589,7 +25156,7 @@
     <w:bookmarkEnd w:id="35"/>
     <w:p>
       <w:pPr>
-        <w:pStyle w:val="a8"/>
+        <w:pStyle w:val="a7"/>
         <w:rPr>
           <w:rtl/>
           <w:lang w:bidi="fa-IR"/>
@@ -25620,13 +25187,13 @@
           <w:rtl/>
           <w:lang w:bidi="fa-IR"/>
         </w:rPr>
-        <w:footnoteReference w:id="6"/>
+        <w:footnoteReference w:id="5"/>
       </w:r>
       <w:bookmarkEnd w:id="36"/>
     </w:p>
     <w:p>
       <w:pPr>
-        <w:pStyle w:val="a8"/>
+        <w:pStyle w:val="a7"/>
         <w:rPr>
           <w:rtl/>
           <w:lang w:bidi="fa-IR"/>
@@ -25695,7 +25262,7 @@
     </w:p>
     <w:p>
       <w:pPr>
-        <w:pStyle w:val="a8"/>
+        <w:pStyle w:val="a7"/>
         <w:rPr>
           <w:rtl/>
           <w:lang w:bidi="fa-IR"/>
@@ -25852,7 +25419,7 @@
     </w:p>
     <w:p>
       <w:pPr>
-        <w:pStyle w:val="a8"/>
+        <w:pStyle w:val="a7"/>
         <w:jc w:val="center"/>
         <w:rPr>
           <w:rtl/>
@@ -25991,7 +25558,7 @@
     </w:p>
     <w:p>
       <w:pPr>
-        <w:pStyle w:val="a1"/>
+        <w:pStyle w:val="af2"/>
         <w:numPr>
           <w:ilvl w:val="0"/>
           <w:numId w:val="0"/>
@@ -26065,7 +25632,7 @@
     </w:p>
     <w:p>
       <w:pPr>
-        <w:pStyle w:val="a8"/>
+        <w:pStyle w:val="a7"/>
         <w:ind w:firstLine="708"/>
         <w:rPr>
           <w:rFonts w:ascii="B Nazanin"/>
@@ -26109,7 +25676,7 @@
     </w:p>
     <w:p>
       <w:pPr>
-        <w:pStyle w:val="a8"/>
+        <w:pStyle w:val="a7"/>
         <w:rPr>
           <w:lang w:bidi="fa-IR"/>
         </w:rPr>
@@ -26117,7 +25684,7 @@
     </w:p>
     <w:p>
       <w:pPr>
-        <w:pStyle w:val="a8"/>
+        <w:pStyle w:val="a7"/>
         <w:rPr>
           <w:rtl/>
           <w:lang w:bidi="fa-IR"/>
@@ -26141,7 +25708,7 @@
     </w:p>
     <w:p>
       <w:pPr>
-        <w:pStyle w:val="a8"/>
+        <w:pStyle w:val="a7"/>
         <w:rPr>
           <w:rtl/>
         </w:rPr>
@@ -26149,7 +25716,7 @@
     </w:p>
     <w:p>
       <w:pPr>
-        <w:pStyle w:val="a8"/>
+        <w:pStyle w:val="a7"/>
         <w:rPr>
           <w:rtl/>
         </w:rPr>
@@ -26204,7 +25771,7 @@
     </w:p>
     <w:p>
       <w:pPr>
-        <w:pStyle w:val="a5"/>
+        <w:pStyle w:val="a4"/>
         <w:numPr>
           <w:ilvl w:val="0"/>
           <w:numId w:val="23"/>
@@ -26247,7 +25814,7 @@
     </w:p>
     <w:p>
       <w:pPr>
-        <w:pStyle w:val="a8"/>
+        <w:pStyle w:val="a7"/>
         <w:ind w:firstLine="0"/>
         <w:rPr>
           <w:rtl/>
@@ -26289,7 +25856,7 @@
     </w:p>
     <w:p>
       <w:pPr>
-        <w:pStyle w:val="a8"/>
+        <w:pStyle w:val="a7"/>
         <w:ind w:firstLine="0"/>
         <w:rPr>
           <w:rtl/>
@@ -26333,7 +25900,7 @@
     </w:p>
     <w:p>
       <w:pPr>
-        <w:pStyle w:val="a8"/>
+        <w:pStyle w:val="a7"/>
         <w:ind w:left="-158" w:firstLine="270"/>
         <w:rPr>
           <w:lang w:bidi="fa-IR"/>
@@ -26398,7 +25965,7 @@
     </w:p>
     <w:p>
       <w:pPr>
-        <w:pStyle w:val="a8"/>
+        <w:pStyle w:val="a7"/>
         <w:ind w:left="-158" w:firstLine="270"/>
         <w:rPr>
           <w:rtl/>
@@ -26432,7 +25999,7 @@
     </w:p>
     <w:p>
       <w:pPr>
-        <w:pStyle w:val="a8"/>
+        <w:pStyle w:val="a7"/>
         <w:rPr>
           <w:rtl/>
           <w:lang w:bidi="fa-IR"/>
@@ -26559,7 +26126,7 @@
     </w:p>
     <w:p>
       <w:pPr>
-        <w:pStyle w:val="a2"/>
+        <w:pStyle w:val="a1"/>
         <w:rPr>
           <w:rtl/>
         </w:rPr>
@@ -27056,7 +26623,7 @@
     </w:tbl>
     <w:p>
       <w:pPr>
-        <w:pStyle w:val="a8"/>
+        <w:pStyle w:val="a7"/>
         <w:spacing w:before="240"/>
         <w:ind w:firstLine="562"/>
         <w:rPr>
@@ -27235,7 +26802,7 @@
     </w:p>
     <w:p>
       <w:pPr>
-        <w:pStyle w:val="a8"/>
+        <w:pStyle w:val="a7"/>
         <w:rPr>
           <w:rtl/>
           <w:lang w:bidi="fa-IR"/>
@@ -27271,13 +26838,13 @@
           <w:rFonts w:ascii="Cambria" w:hAnsi="Cambria"/>
           <w:rtl/>
         </w:rPr>
-        <w:footnoteReference w:id="7"/>
+        <w:footnoteReference w:id="6"/>
       </w:r>
       <w:bookmarkEnd w:id="50"/>
     </w:p>
     <w:p>
       <w:pPr>
-        <w:pStyle w:val="a8"/>
+        <w:pStyle w:val="a7"/>
         <w:rPr>
           <w:rtl/>
           <w:lang w:bidi="fa-IR"/>
@@ -27368,7 +26935,7 @@
     </w:p>
     <w:p>
       <w:pPr>
-        <w:pStyle w:val="a8"/>
+        <w:pStyle w:val="a7"/>
         <w:ind w:left="-158" w:firstLine="270"/>
         <w:rPr>
           <w:rtl/>
@@ -27485,7 +27052,7 @@
     </w:p>
     <w:p>
       <w:pPr>
-        <w:pStyle w:val="a5"/>
+        <w:pStyle w:val="a4"/>
         <w:numPr>
           <w:ilvl w:val="0"/>
           <w:numId w:val="23"/>
@@ -27527,7 +27094,7 @@
     </w:p>
     <w:p>
       <w:pPr>
-        <w:pStyle w:val="a8"/>
+        <w:pStyle w:val="a7"/>
         <w:rPr>
           <w:rtl/>
           <w:lang w:bidi="fa-IR"/>
@@ -27787,7 +27354,7 @@
     </w:p>
     <w:p>
       <w:pPr>
-        <w:pStyle w:val="a5"/>
+        <w:pStyle w:val="a4"/>
         <w:numPr>
           <w:ilvl w:val="0"/>
           <w:numId w:val="11"/>
@@ -27837,7 +27404,7 @@
     </w:p>
     <w:p>
       <w:pPr>
-        <w:pStyle w:val="a8"/>
+        <w:pStyle w:val="a7"/>
         <w:rPr>
           <w:rtl/>
           <w:lang w:bidi="fa-IR"/>
@@ -27863,7 +27430,7 @@
     </w:p>
     <w:p>
       <w:pPr>
-        <w:pStyle w:val="a8"/>
+        <w:pStyle w:val="a7"/>
         <w:rPr>
           <w:rtl/>
           <w:lang w:bidi="fa-IR"/>
@@ -27902,7 +27469,7 @@
     </w:p>
     <w:p>
       <w:pPr>
-        <w:pStyle w:val="af2"/>
+        <w:pStyle w:val="af1"/>
         <w:rPr>
           <w:rtl/>
         </w:rPr>
@@ -27945,7 +27512,7 @@
     </w:p>
     <w:p>
       <w:pPr>
-        <w:pStyle w:val="a8"/>
+        <w:pStyle w:val="a7"/>
         <w:rPr>
           <w:lang w:bidi="fa-IR"/>
         </w:rPr>
@@ -27993,7 +27560,7 @@
     </w:p>
     <w:p>
       <w:pPr>
-        <w:pStyle w:val="a8"/>
+        <w:pStyle w:val="a7"/>
         <w:rPr>
           <w:rtl/>
           <w:lang w:bidi="fa-IR"/>
@@ -28041,7 +27608,7 @@
     </w:p>
     <w:p>
       <w:pPr>
-        <w:pStyle w:val="a8"/>
+        <w:pStyle w:val="a7"/>
         <w:rPr>
           <w:rtl/>
           <w:lang w:bidi="fa-IR"/>
@@ -28082,7 +27649,7 @@
     </w:p>
     <w:p>
       <w:pPr>
-        <w:pStyle w:val="a8"/>
+        <w:pStyle w:val="a7"/>
         <w:rPr>
           <w:rtl/>
           <w:lang w:bidi="fa-IR"/>
@@ -28121,7 +27688,7 @@
     </w:p>
     <w:p>
       <w:pPr>
-        <w:pStyle w:val="a8"/>
+        <w:pStyle w:val="a7"/>
         <w:rPr>
           <w:rtl/>
           <w:lang w:bidi="fa-IR"/>
@@ -28231,7 +27798,7 @@
     </w:p>
     <w:p>
       <w:pPr>
-        <w:pStyle w:val="a8"/>
+        <w:pStyle w:val="a7"/>
         <w:keepNext/>
         <w:jc w:val="center"/>
       </w:pPr>
@@ -28297,7 +27864,7 @@
     </w:p>
     <w:p>
       <w:pPr>
-        <w:pStyle w:val="a1"/>
+        <w:pStyle w:val="af2"/>
         <w:rPr>
           <w:rtl/>
         </w:rPr>
@@ -28433,7 +28000,7 @@
     </w:p>
     <w:p>
       <w:pPr>
-        <w:pStyle w:val="a8"/>
+        <w:pStyle w:val="a7"/>
         <w:rPr>
           <w:lang w:bidi="fa-IR"/>
         </w:rPr>
@@ -28441,7 +28008,7 @@
     </w:p>
     <w:p>
       <w:pPr>
-        <w:pStyle w:val="a8"/>
+        <w:pStyle w:val="a7"/>
         <w:rPr>
           <w:rtl/>
           <w:lang w:bidi="fa-IR"/>
@@ -28552,7 +28119,7 @@
     </w:p>
     <w:p>
       <w:pPr>
-        <w:pStyle w:val="a8"/>
+        <w:pStyle w:val="a7"/>
         <w:rPr>
           <w:rtl/>
           <w:lang w:bidi="fa-IR"/>
@@ -28569,7 +28136,7 @@
     </w:p>
     <w:p>
       <w:pPr>
-        <w:pStyle w:val="a2"/>
+        <w:pStyle w:val="a1"/>
         <w:rPr>
           <w:rtl/>
         </w:rPr>
@@ -28945,7 +28512,7 @@
     </w:tbl>
     <w:p>
       <w:pPr>
-        <w:pStyle w:val="a8"/>
+        <w:pStyle w:val="a7"/>
         <w:rPr>
           <w:rtl/>
           <w:lang w:bidi="fa-IR"/>
@@ -28962,7 +28529,7 @@
     </w:p>
     <w:p>
       <w:pPr>
-        <w:pStyle w:val="a8"/>
+        <w:pStyle w:val="a7"/>
         <w:rPr>
           <w:lang w:bidi="fa-IR"/>
         </w:rPr>
@@ -28970,7 +28537,7 @@
     </w:p>
     <w:p>
       <w:pPr>
-        <w:pStyle w:val="a8"/>
+        <w:pStyle w:val="a7"/>
         <w:rPr>
           <w:rtl/>
           <w:lang w:bidi="fa-IR"/>
@@ -28979,7 +28546,7 @@
     </w:p>
     <w:p>
       <w:pPr>
-        <w:pStyle w:val="a8"/>
+        <w:pStyle w:val="a7"/>
         <w:rPr>
           <w:rtl/>
           <w:lang w:bidi="fa-IR"/>
@@ -28988,7 +28555,7 @@
     </w:p>
     <w:p>
       <w:pPr>
-        <w:pStyle w:val="a8"/>
+        <w:pStyle w:val="a7"/>
         <w:rPr>
           <w:rtl/>
           <w:lang w:bidi="fa-IR"/>
@@ -28997,7 +28564,7 @@
     </w:p>
     <w:p>
       <w:pPr>
-        <w:pStyle w:val="a8"/>
+        <w:pStyle w:val="a7"/>
         <w:rPr>
           <w:rtl/>
           <w:lang w:bidi="fa-IR"/>
@@ -29006,7 +28573,7 @@
     </w:p>
     <w:p>
       <w:pPr>
-        <w:pStyle w:val="a8"/>
+        <w:pStyle w:val="a7"/>
         <w:rPr>
           <w:rtl/>
           <w:lang w:bidi="fa-IR"/>
@@ -29087,7 +28654,7 @@
     </w:p>
     <w:p>
       <w:pPr>
-        <w:pStyle w:val="a5"/>
+        <w:pStyle w:val="a4"/>
         <w:numPr>
           <w:ilvl w:val="0"/>
           <w:numId w:val="11"/>
@@ -29109,7 +28676,7 @@
     </w:p>
     <w:p>
       <w:pPr>
-        <w:pStyle w:val="a8"/>
+        <w:pStyle w:val="a7"/>
         <w:rPr>
           <w:rtl/>
           <w:lang w:bidi="fa-IR"/>
@@ -29135,7 +28702,7 @@
     </w:p>
     <w:p>
       <w:pPr>
-        <w:pStyle w:val="a8"/>
+        <w:pStyle w:val="a7"/>
         <w:rPr>
           <w:rtl/>
           <w:lang w:bidi="fa-IR"/>
@@ -29351,7 +28918,7 @@
     </w:p>
     <w:p>
       <w:pPr>
-        <w:pStyle w:val="a5"/>
+        <w:pStyle w:val="a4"/>
         <w:rPr>
           <w:rtl/>
         </w:rPr>
@@ -29392,7 +28959,7 @@
     </w:p>
     <w:p>
       <w:pPr>
-        <w:pStyle w:val="a8"/>
+        <w:pStyle w:val="a7"/>
         <w:rPr>
           <w:rtl/>
           <w:lang w:bidi="fa-IR"/>
@@ -29401,7 +28968,7 @@
     </w:p>
     <w:p>
       <w:pPr>
-        <w:pStyle w:val="a8"/>
+        <w:pStyle w:val="a7"/>
         <w:rPr>
           <w:rtl/>
           <w:lang w:bidi="fa-IR"/>
@@ -29459,92 +29026,92 @@
     </w:p>
     <w:p>
       <w:pPr>
-        <w:pStyle w:val="a8"/>
+        <w:pStyle w:val="a7"/>
       </w:pPr>
     </w:p>
     <w:p>
       <w:pPr>
-        <w:pStyle w:val="a8"/>
+        <w:pStyle w:val="a7"/>
       </w:pPr>
     </w:p>
     <w:p>
       <w:pPr>
-        <w:pStyle w:val="a8"/>
+        <w:pStyle w:val="a7"/>
       </w:pPr>
     </w:p>
     <w:p>
       <w:pPr>
-        <w:pStyle w:val="a8"/>
+        <w:pStyle w:val="a7"/>
       </w:pPr>
     </w:p>
     <w:p>
       <w:pPr>
-        <w:pStyle w:val="a8"/>
+        <w:pStyle w:val="a7"/>
       </w:pPr>
     </w:p>
     <w:p>
       <w:pPr>
-        <w:pStyle w:val="a8"/>
+        <w:pStyle w:val="a7"/>
       </w:pPr>
     </w:p>
     <w:p>
       <w:pPr>
-        <w:pStyle w:val="a8"/>
+        <w:pStyle w:val="a7"/>
       </w:pPr>
     </w:p>
     <w:p>
       <w:pPr>
-        <w:pStyle w:val="a8"/>
+        <w:pStyle w:val="a7"/>
       </w:pPr>
     </w:p>
     <w:p>
       <w:pPr>
-        <w:pStyle w:val="a8"/>
+        <w:pStyle w:val="a7"/>
       </w:pPr>
     </w:p>
     <w:p>
       <w:pPr>
-        <w:pStyle w:val="a8"/>
+        <w:pStyle w:val="a7"/>
       </w:pPr>
     </w:p>
     <w:p>
       <w:pPr>
-        <w:pStyle w:val="a8"/>
+        <w:pStyle w:val="a7"/>
       </w:pPr>
     </w:p>
     <w:p>
       <w:pPr>
-        <w:pStyle w:val="a8"/>
+        <w:pStyle w:val="a7"/>
       </w:pPr>
     </w:p>
     <w:p>
       <w:pPr>
-        <w:pStyle w:val="a8"/>
+        <w:pStyle w:val="a7"/>
       </w:pPr>
     </w:p>
     <w:p>
       <w:pPr>
-        <w:pStyle w:val="a8"/>
+        <w:pStyle w:val="a7"/>
       </w:pPr>
     </w:p>
     <w:p>
       <w:pPr>
-        <w:pStyle w:val="a8"/>
+        <w:pStyle w:val="a7"/>
       </w:pPr>
     </w:p>
     <w:p>
       <w:pPr>
-        <w:pStyle w:val="a8"/>
+        <w:pStyle w:val="a7"/>
       </w:pPr>
     </w:p>
     <w:p>
       <w:pPr>
-        <w:pStyle w:val="a8"/>
+        <w:pStyle w:val="a7"/>
       </w:pPr>
     </w:p>
     <w:p>
       <w:pPr>
-        <w:pStyle w:val="a8"/>
+        <w:pStyle w:val="a7"/>
         <w:rPr>
           <w:lang w:bidi="fa-IR"/>
         </w:rPr>
@@ -29552,7 +29119,7 @@
     </w:p>
     <w:p>
       <w:pPr>
-        <w:pStyle w:val="a8"/>
+        <w:pStyle w:val="a7"/>
         <w:rPr>
           <w:lang w:bidi="fa-IR"/>
         </w:rPr>
@@ -29560,7 +29127,7 @@
     </w:p>
     <w:p>
       <w:pPr>
-        <w:pStyle w:val="a8"/>
+        <w:pStyle w:val="a7"/>
         <w:rPr>
           <w:lang w:bidi="fa-IR"/>
         </w:rPr>
@@ -29568,7 +29135,7 @@
     </w:p>
     <w:p>
       <w:pPr>
-        <w:pStyle w:val="a8"/>
+        <w:pStyle w:val="a7"/>
         <w:rPr>
           <w:lang w:bidi="fa-IR"/>
         </w:rPr>
@@ -29576,7 +29143,7 @@
     </w:p>
     <w:p>
       <w:pPr>
-        <w:pStyle w:val="a8"/>
+        <w:pStyle w:val="a7"/>
         <w:rPr>
           <w:lang w:bidi="fa-IR"/>
         </w:rPr>
@@ -29584,7 +29151,7 @@
     </w:p>
     <w:p>
       <w:pPr>
-        <w:pStyle w:val="a8"/>
+        <w:pStyle w:val="a7"/>
         <w:rPr>
           <w:lang w:bidi="fa-IR"/>
         </w:rPr>
@@ -29592,7 +29159,7 @@
     </w:p>
     <w:p>
       <w:pPr>
-        <w:pStyle w:val="a8"/>
+        <w:pStyle w:val="a7"/>
         <w:rPr>
           <w:lang w:bidi="fa-IR"/>
         </w:rPr>
@@ -29600,7 +29167,7 @@
     </w:p>
     <w:p>
       <w:pPr>
-        <w:pStyle w:val="a8"/>
+        <w:pStyle w:val="a7"/>
         <w:rPr>
           <w:lang w:bidi="fa-IR"/>
         </w:rPr>
@@ -29608,7 +29175,7 @@
     </w:p>
     <w:p>
       <w:pPr>
-        <w:pStyle w:val="a8"/>
+        <w:pStyle w:val="a7"/>
         <w:rPr>
           <w:lang w:bidi="fa-IR"/>
         </w:rPr>
@@ -29616,7 +29183,7 @@
     </w:p>
     <w:p>
       <w:pPr>
-        <w:pStyle w:val="a8"/>
+        <w:pStyle w:val="a7"/>
         <w:rPr>
           <w:lang w:bidi="fa-IR"/>
         </w:rPr>
@@ -29624,7 +29191,7 @@
     </w:p>
     <w:p>
       <w:pPr>
-        <w:pStyle w:val="a8"/>
+        <w:pStyle w:val="a7"/>
         <w:rPr>
           <w:lang w:bidi="fa-IR"/>
         </w:rPr>
@@ -29632,7 +29199,7 @@
     </w:p>
     <w:p>
       <w:pPr>
-        <w:pStyle w:val="a8"/>
+        <w:pStyle w:val="a7"/>
         <w:rPr>
           <w:lang w:bidi="fa-IR"/>
         </w:rPr>
@@ -29640,7 +29207,7 @@
     </w:p>
     <w:p>
       <w:pPr>
-        <w:pStyle w:val="a8"/>
+        <w:pStyle w:val="a7"/>
         <w:rPr>
           <w:lang w:bidi="fa-IR"/>
         </w:rPr>
@@ -29648,7 +29215,7 @@
     </w:p>
     <w:p>
       <w:pPr>
-        <w:pStyle w:val="a8"/>
+        <w:pStyle w:val="a7"/>
         <w:rPr>
           <w:lang w:bidi="fa-IR"/>
         </w:rPr>
@@ -29656,7 +29223,7 @@
     </w:p>
     <w:p>
       <w:pPr>
-        <w:pStyle w:val="a8"/>
+        <w:pStyle w:val="a7"/>
         <w:rPr>
           <w:rtl/>
           <w:lang w:bidi="fa-IR"/>
@@ -29679,13 +29246,13 @@
     </w:p>
     <w:p>
       <w:pPr>
-        <w:pStyle w:val="a8"/>
+        <w:pStyle w:val="a7"/>
         <w:bidi w:val="0"/>
       </w:pPr>
     </w:p>
     <w:p>
       <w:pPr>
-        <w:pStyle w:val="a8"/>
+        <w:pStyle w:val="a7"/>
         <w:bidi w:val="0"/>
         <w:rPr>
           <w:b/>
@@ -29697,7 +29264,7 @@
     </w:p>
     <w:p>
       <w:pPr>
-        <w:pStyle w:val="a8"/>
+        <w:pStyle w:val="a7"/>
         <w:bidi w:val="0"/>
         <w:rPr>
           <w:b/>
@@ -29718,7 +29285,7 @@
     </w:p>
     <w:p>
       <w:pPr>
-        <w:pStyle w:val="a8"/>
+        <w:pStyle w:val="a7"/>
         <w:bidi w:val="0"/>
         <w:rPr>
           <w:b/>
@@ -29730,7 +29297,7 @@
     </w:p>
     <w:p>
       <w:pPr>
-        <w:pStyle w:val="a8"/>
+        <w:pStyle w:val="a7"/>
         <w:bidi w:val="0"/>
         <w:spacing w:line="360" w:lineRule="auto"/>
         <w:rPr>
@@ -29740,7 +29307,7 @@
     </w:p>
     <w:p>
       <w:pPr>
-        <w:pStyle w:val="a8"/>
+        <w:pStyle w:val="a7"/>
         <w:bidi w:val="0"/>
         <w:spacing w:line="360" w:lineRule="auto"/>
         <w:rPr>
@@ -29770,7 +29337,7 @@
     </w:p>
     <w:p>
       <w:pPr>
-        <w:pStyle w:val="a8"/>
+        <w:pStyle w:val="a7"/>
         <w:bidi w:val="0"/>
         <w:spacing w:line="360" w:lineRule="auto"/>
         <w:jc w:val="both"/>
@@ -29783,7 +29350,7 @@
     </w:p>
     <w:p>
       <w:pPr>
-        <w:pStyle w:val="a8"/>
+        <w:pStyle w:val="a7"/>
         <w:bidi w:val="0"/>
         <w:spacing w:line="240" w:lineRule="auto"/>
         <w:rPr>
@@ -29793,7 +29360,7 @@
     </w:p>
     <w:p>
       <w:pPr>
-        <w:pStyle w:val="a8"/>
+        <w:pStyle w:val="a7"/>
         <w:bidi w:val="0"/>
         <w:spacing w:line="240" w:lineRule="auto"/>
         <w:rPr>
@@ -29803,7 +29370,7 @@
     </w:p>
     <w:p>
       <w:pPr>
-        <w:pStyle w:val="a8"/>
+        <w:pStyle w:val="a7"/>
         <w:bidi w:val="0"/>
         <w:spacing w:line="360" w:lineRule="auto"/>
         <w:rPr>
@@ -29823,7 +29390,7 @@
     </w:p>
     <w:p>
       <w:pPr>
-        <w:pStyle w:val="a8"/>
+        <w:pStyle w:val="a7"/>
         <w:bidi w:val="0"/>
         <w:spacing w:line="360" w:lineRule="auto"/>
         <w:rPr>
@@ -29835,7 +29402,7 @@
     </w:p>
     <w:p>
       <w:pPr>
-        <w:pStyle w:val="a8"/>
+        <w:pStyle w:val="a7"/>
         <w:bidi w:val="0"/>
         <w:spacing w:line="360" w:lineRule="auto"/>
         <w:rPr>
@@ -30460,7 +30027,6 @@
       <w:pPr>
         <w:bidi w:val="0"/>
         <w:rPr>
-          <w:rFonts w:hint="cs"/>
           <w:rtl/>
         </w:rPr>
       </w:pPr>
@@ -31044,7 +30610,7 @@
   <w:footnote w:id="1">
     <w:p>
       <w:pPr>
-        <w:pStyle w:val="af1"/>
+        <w:pStyle w:val="af0"/>
         <w:rPr>
           <w:rtl/>
         </w:rPr>
@@ -31095,7 +30661,7 @@
   <w:footnote w:id="3">
     <w:p>
       <w:pPr>
-        <w:pStyle w:val="af1"/>
+        <w:pStyle w:val="af0"/>
         <w:rPr>
           <w:lang w:val="en-US"/>
         </w:rPr>
@@ -31125,67 +30691,42 @@
       <w:pPr>
         <w:pStyle w:val="Footnote"/>
         <w:rPr>
-          <w:lang w:val="en-US"/>
+          <w:rtl/>
         </w:rPr>
       </w:pPr>
       <w:r>
         <w:rPr>
           <w:rStyle w:val="FootnoteReference"/>
+          <w:sz w:val="20"/>
+          <w:szCs w:val="24"/>
         </w:rPr>
         <w:footnoteRef/>
       </w:r>
       <w:r>
-        <w:t xml:space="preserve">. </w:t>
-      </w:r>
-      <w:r>
-        <w:t>Reciprocal Rank Fusion</w:t>
+        <w:t>. Semantic Space</w:t>
       </w:r>
     </w:p>
   </w:footnote>
   <w:footnote w:id="5">
     <w:p>
       <w:pPr>
-        <w:pStyle w:val="Footnote"/>
-        <w:rPr>
-          <w:rtl/>
-        </w:rPr>
+        <w:pStyle w:val="FootnoteText"/>
       </w:pPr>
       <w:r>
         <w:rPr>
           <w:rStyle w:val="FootnoteReference"/>
-          <w:sz w:val="20"/>
-          <w:szCs w:val="24"/>
         </w:rPr>
         <w:footnoteRef/>
       </w:r>
       <w:r>
-        <w:t xml:space="preserve">. </w:t>
-      </w:r>
-      <w:r>
-        <w:t>Semantic Space</w:t>
+        <w:t xml:space="preserve"> </w:t>
+      </w:r>
+      <w:r>
+        <w:t xml:space="preserve">Stochastic </w:t>
       </w:r>
     </w:p>
   </w:footnote>
   <w:footnote w:id="6">
-    <w:p>
-      <w:pPr>
-        <w:pStyle w:val="FootnoteText"/>
-      </w:pPr>
-      <w:r>
-        <w:rPr>
-          <w:rStyle w:val="FootnoteReference"/>
-        </w:rPr>
-        <w:footnoteRef/>
-      </w:r>
-      <w:r>
-        <w:t xml:space="preserve"> </w:t>
-      </w:r>
-      <w:r>
-        <w:t xml:space="preserve">Stochastic </w:t>
-      </w:r>
-    </w:p>
-  </w:footnote>
-  <w:footnote w:id="7">
     <w:p>
       <w:pPr>
         <w:pStyle w:val="FootnoteText"/>
@@ -32803,7 +32344,6 @@
       <w:start w:val="1"/>
       <w:numFmt w:val="decimal"/>
       <w:lvlRestart w:val="1"/>
-      <w:pStyle w:val="a1"/>
       <w:suff w:val="space"/>
       <w:lvlText w:val="شکل (%1-%6) "/>
       <w:lvlJc w:val="left"/>
@@ -32864,7 +32404,7 @@
       <w:start w:val="1"/>
       <w:numFmt w:val="decimal"/>
       <w:lvlRestart w:val="1"/>
-      <w:pStyle w:val="a2"/>
+      <w:pStyle w:val="a1"/>
       <w:suff w:val="space"/>
       <w:lvlText w:val="جدول (%1-%8) "/>
       <w:lvlJc w:val="left"/>
@@ -32901,7 +32441,7 @@
     <w:lvl w:ilvl="0" w:tplc="9C98228E">
       <w:start w:val="1"/>
       <w:numFmt w:val="decimal"/>
-      <w:pStyle w:val="a3"/>
+      <w:pStyle w:val="a2"/>
       <w:lvlText w:val="[%1]"/>
       <w:lvlJc w:val="left"/>
       <w:pPr>
@@ -36931,7 +36471,7 @@
     <w:lvl w:ilvl="0" w:tplc="04360001">
       <w:start w:val="1"/>
       <w:numFmt w:val="bullet"/>
-      <w:pStyle w:val="a4"/>
+      <w:pStyle w:val="a3"/>
       <w:lvlText w:val=""/>
       <w:lvlJc w:val="left"/>
       <w:pPr>
@@ -38434,7 +37974,7 @@
   </w:style>
   <w:style w:type="paragraph" w:styleId="Title">
     <w:name w:val="Title"/>
-    <w:basedOn w:val="a5"/>
+    <w:basedOn w:val="a4"/>
     <w:next w:val="Normal"/>
     <w:link w:val="TitleChar"/>
     <w:uiPriority w:val="10"/>
@@ -38448,7 +37988,7 @@
       <w:w w:val="0"/>
     </w:rPr>
   </w:style>
-  <w:style w:type="paragraph" w:customStyle="1" w:styleId="a5">
+  <w:style w:type="paragraph" w:customStyle="1" w:styleId="a4">
     <w:name w:val="فصل"/>
     <w:next w:val="Normal"/>
     <w:link w:val="Char"/>
@@ -38478,7 +38018,7 @@
   </w:style>
   <w:style w:type="character" w:customStyle="1" w:styleId="Char">
     <w:name w:val="فصل Char"/>
-    <w:link w:val="a5"/>
+    <w:link w:val="a4"/>
     <w:rsid w:val="008A5914"/>
     <w:rPr>
       <w:rFonts w:ascii="Times New Roman" w:hAnsi="Times New Roman" w:cs="B Titr"/>
@@ -38839,7 +38379,7 @@
       <w:szCs w:val="28"/>
     </w:rPr>
   </w:style>
-  <w:style w:type="paragraph" w:customStyle="1" w:styleId="a6">
+  <w:style w:type="paragraph" w:customStyle="1" w:styleId="a5">
     <w:name w:val="عنوان پايان‌نامه"/>
     <w:basedOn w:val="Normal"/>
     <w:next w:val="Normal"/>
@@ -38857,7 +38397,7 @@
       <w:szCs w:val="44"/>
     </w:rPr>
   </w:style>
-  <w:style w:type="paragraph" w:customStyle="1" w:styleId="a7">
+  <w:style w:type="paragraph" w:customStyle="1" w:styleId="a6">
     <w:name w:val="متن روي جلد"/>
     <w:basedOn w:val="Normal"/>
     <w:rsid w:val="00587E8B"/>
@@ -38885,7 +38425,7 @@
       <w:ind w:left="1680"/>
     </w:pPr>
   </w:style>
-  <w:style w:type="paragraph" w:customStyle="1" w:styleId="a8">
+  <w:style w:type="paragraph" w:customStyle="1" w:styleId="a7">
     <w:name w:val="متن"/>
     <w:link w:val="Char0"/>
     <w:rsid w:val="00143A5B"/>
@@ -38904,7 +38444,7 @@
   </w:style>
   <w:style w:type="character" w:customStyle="1" w:styleId="Char0">
     <w:name w:val="متن Char"/>
-    <w:link w:val="a8"/>
+    <w:link w:val="a7"/>
     <w:rsid w:val="00143A5B"/>
     <w:rPr>
       <w:rFonts w:ascii="Times New Roman" w:eastAsia="Times New Roman" w:hAnsi="Times New Roman" w:cs="B Nazanin"/>
@@ -38913,9 +38453,9 @@
       <w:lang w:val="en-US" w:eastAsia="en-US" w:bidi="ar-SA"/>
     </w:rPr>
   </w:style>
-  <w:style w:type="paragraph" w:customStyle="1" w:styleId="a9">
+  <w:style w:type="paragraph" w:customStyle="1" w:styleId="a8">
     <w:name w:val="فرمول"/>
-    <w:next w:val="a8"/>
+    <w:next w:val="a7"/>
     <w:rsid w:val="00F772A3"/>
     <w:pPr>
       <w:widowControl w:val="0"/>
@@ -38943,7 +38483,7 @@
   </w:style>
   <w:style w:type="paragraph" w:customStyle="1" w:styleId="-">
     <w:name w:val="شکل - جدول"/>
-    <w:basedOn w:val="a8"/>
+    <w:basedOn w:val="a7"/>
     <w:link w:val="-Char"/>
     <w:rsid w:val="00F772A3"/>
     <w:pPr>
@@ -38968,7 +38508,7 @@
       <w:lang w:val="en-US" w:eastAsia="en-US" w:bidi="ar-SA"/>
     </w:rPr>
   </w:style>
-  <w:style w:type="paragraph" w:customStyle="1" w:styleId="aa">
+  <w:style w:type="paragraph" w:customStyle="1" w:styleId="a9">
     <w:name w:val="زيرنويس شکل"/>
     <w:next w:val="Normal"/>
     <w:link w:val="Char1"/>
@@ -38992,7 +38532,7 @@
       <w:lang w:bidi="fa-IR"/>
     </w:rPr>
   </w:style>
-  <w:style w:type="paragraph" w:customStyle="1" w:styleId="a4">
+  <w:style w:type="paragraph" w:customStyle="1" w:styleId="a3">
     <w:name w:val="تيتر سوم"/>
     <w:basedOn w:val="Normal"/>
     <w:rsid w:val="007C5232"/>
@@ -39058,7 +38598,7 @@
       <w:lang w:bidi="fa-IR"/>
     </w:rPr>
   </w:style>
-  <w:style w:type="paragraph" w:customStyle="1" w:styleId="a2">
+  <w:style w:type="paragraph" w:customStyle="1" w:styleId="a1">
     <w:name w:val="بالانويس جدول"/>
     <w:next w:val="Normal"/>
     <w:qFormat/>
@@ -39081,10 +38621,10 @@
       <w:lang w:bidi="fa-IR"/>
     </w:rPr>
   </w:style>
-  <w:style w:type="paragraph" w:customStyle="1" w:styleId="ab">
+  <w:style w:type="paragraph" w:customStyle="1" w:styleId="aa">
     <w:name w:val="عنوان فهرست"/>
-    <w:basedOn w:val="a8"/>
-    <w:next w:val="a8"/>
+    <w:basedOn w:val="a7"/>
+    <w:next w:val="a7"/>
     <w:rsid w:val="00F772A3"/>
     <w:pPr>
       <w:spacing w:after="240"/>
@@ -39135,7 +38675,7 @@
       <w:lang w:val="af-ZA" w:eastAsia="af-ZA"/>
     </w:rPr>
   </w:style>
-  <w:style w:type="paragraph" w:customStyle="1" w:styleId="ac">
+  <w:style w:type="paragraph" w:customStyle="1" w:styleId="ab">
     <w:name w:val="متن پيوسته"/>
     <w:basedOn w:val="Normal"/>
     <w:rsid w:val="00F772A3"/>
@@ -39148,7 +38688,7 @@
   </w:style>
   <w:style w:type="paragraph" w:customStyle="1" w:styleId="Title2">
     <w:name w:val="Title2"/>
-    <w:basedOn w:val="a8"/>
+    <w:basedOn w:val="a7"/>
     <w:rsid w:val="00F772A3"/>
     <w:pPr>
       <w:spacing w:after="360"/>
@@ -39177,7 +38717,7 @@
       <w:lang w:bidi="ar-SA"/>
     </w:rPr>
   </w:style>
-  <w:style w:type="paragraph" w:customStyle="1" w:styleId="ad">
+  <w:style w:type="paragraph" w:customStyle="1" w:styleId="ac">
     <w:name w:val="تاريخ روي جلد انگليسي"/>
     <w:basedOn w:val="Normal"/>
     <w:rsid w:val="00F772A3"/>
@@ -39194,7 +38734,7 @@
       <w:szCs w:val="24"/>
     </w:rPr>
   </w:style>
-  <w:style w:type="paragraph" w:customStyle="1" w:styleId="ae">
+  <w:style w:type="paragraph" w:customStyle="1" w:styleId="ad">
     <w:name w:val="متن روي جلد انگليسي"/>
     <w:basedOn w:val="Normal"/>
     <w:rsid w:val="00F772A3"/>
@@ -39210,7 +38750,7 @@
       <w:sz w:val="28"/>
     </w:rPr>
   </w:style>
-  <w:style w:type="paragraph" w:customStyle="1" w:styleId="af">
+  <w:style w:type="paragraph" w:customStyle="1" w:styleId="ae">
     <w:name w:val="عنوان پايان‌نامه انگليسي"/>
     <w:basedOn w:val="Normal"/>
     <w:rsid w:val="00F772A3"/>
@@ -39246,18 +38786,18 @@
       <w:lang w:val="en-GB" w:eastAsia="en-GB"/>
     </w:rPr>
   </w:style>
-  <w:style w:type="paragraph" w:customStyle="1" w:styleId="af0">
+  <w:style w:type="paragraph" w:customStyle="1" w:styleId="af">
     <w:name w:val="متن (انگليسي)"/>
-    <w:basedOn w:val="a8"/>
+    <w:basedOn w:val="a7"/>
     <w:rsid w:val="00F772A3"/>
     <w:pPr>
       <w:bidi w:val="0"/>
       <w:spacing w:line="240" w:lineRule="auto"/>
     </w:pPr>
   </w:style>
-  <w:style w:type="paragraph" w:customStyle="1" w:styleId="a3">
+  <w:style w:type="paragraph" w:customStyle="1" w:styleId="a2">
     <w:name w:val="شماره گذاري مراجع"/>
-    <w:basedOn w:val="af0"/>
+    <w:basedOn w:val="af"/>
     <w:rsid w:val="00F772A3"/>
     <w:pPr>
       <w:widowControl/>
@@ -39526,7 +39066,7 @@
       <w:ind w:left="384" w:hanging="384"/>
     </w:pPr>
   </w:style>
-  <w:style w:type="paragraph" w:customStyle="1" w:styleId="af1">
+  <w:style w:type="paragraph" w:customStyle="1" w:styleId="af0">
     <w:name w:val="زیرنویس انگلیسی"/>
     <w:basedOn w:val="FootnoteText"/>
     <w:link w:val="Char3"/>
@@ -39545,7 +39085,7 @@
   </w:style>
   <w:style w:type="character" w:customStyle="1" w:styleId="Char3">
     <w:name w:val="زیرنویس انگلیسی Char"/>
-    <w:link w:val="af1"/>
+    <w:link w:val="af0"/>
     <w:rsid w:val="00A34687"/>
     <w:rPr>
       <w:rFonts w:ascii="Times New Roman" w:eastAsia="Times New Roman" w:hAnsi="Times New Roman" w:cs="Times New Roman"/>
@@ -39614,7 +39154,7 @@
   </w:style>
   <w:style w:type="paragraph" w:customStyle="1" w:styleId="Style1">
     <w:name w:val="Style1"/>
-    <w:basedOn w:val="a5"/>
+    <w:basedOn w:val="a4"/>
     <w:link w:val="Style1Char"/>
     <w:rsid w:val="008A5914"/>
   </w:style>
@@ -40181,9 +39721,9 @@
       <w:szCs w:val="24"/>
     </w:rPr>
   </w:style>
-  <w:style w:type="paragraph" w:customStyle="1" w:styleId="af2">
+  <w:style w:type="paragraph" w:customStyle="1" w:styleId="af1">
     <w:name w:val="نرمال"/>
-    <w:basedOn w:val="a8"/>
+    <w:basedOn w:val="a7"/>
     <w:link w:val="Char4"/>
     <w:qFormat/>
     <w:rsid w:val="002D5E5F"/>
@@ -40216,7 +39756,7 @@
   <w:style w:type="character" w:customStyle="1" w:styleId="Char4">
     <w:name w:val="نرمال Char"/>
     <w:basedOn w:val="Char0"/>
-    <w:link w:val="af2"/>
+    <w:link w:val="af1"/>
     <w:rsid w:val="002D5E5F"/>
     <w:rPr>
       <w:rFonts w:ascii="Times New Roman" w:eastAsia="Times New Roman" w:hAnsi="Times New Roman" w:cs="B Nazanin"/>
@@ -40445,9 +39985,9 @@
       </w:tblBorders>
     </w:tblPr>
   </w:style>
-  <w:style w:type="paragraph" w:customStyle="1" w:styleId="a1">
+  <w:style w:type="paragraph" w:customStyle="1" w:styleId="af2">
     <w:name w:val="تیتر شکل"/>
-    <w:basedOn w:val="aa"/>
+    <w:basedOn w:val="a9"/>
     <w:link w:val="Char5"/>
     <w:qFormat/>
     <w:rsid w:val="00F82443"/>
@@ -40461,7 +40001,7 @@
   <w:style w:type="character" w:customStyle="1" w:styleId="Char1">
     <w:name w:val="زيرنويس شکل Char"/>
     <w:basedOn w:val="DefaultParagraphFont"/>
-    <w:link w:val="aa"/>
+    <w:link w:val="a9"/>
     <w:rsid w:val="00D1344E"/>
     <w:rPr>
       <w:rFonts w:ascii="Times New Roman" w:hAnsi="Times New Roman" w:cs="B Nazanin"/>
@@ -40473,7 +40013,7 @@
   <w:style w:type="character" w:customStyle="1" w:styleId="Char5">
     <w:name w:val="تیتر شکل Char"/>
     <w:basedOn w:val="Char1"/>
-    <w:link w:val="a1"/>
+    <w:link w:val="af2"/>
     <w:rsid w:val="00F82443"/>
     <w:rPr>
       <w:rFonts w:ascii="Times New Roman" w:hAnsi="Times New Roman" w:cs="B Nazanin"/>

</xml_diff>